<commit_message>
Explicita cómo obtuvo Colton cada difusividad en agua
La Tabla I del paper no involucra membranas: son difusividades en
solución libre. Distingue por columnas si el valor fue medido, tomado
de literatura o estimado por correlación, y declara la precisión de
cada uno. Eso no se veía en la interfaz.

El caso que importa: el D en agua de la Vitamina B12 NO fue medido por
los autores. Las columnas de literatura y medición están vacías en esa
fila; el 3,79e-10 sale de la correlación de Polson, adoptado con un
15 % de precisión declarada. El de la urea sí fue medido (3 %).

No afecta la respuesta del punto 4, que se apoya en las resistencias
medidas de la Tabla III, pero sí la descomposición del cociente entre
solución libre y estorbo en el poro.

Co-Authored-By: Claude Opus 5 <noreply@anthropic.com>
</commit_message>
<xml_diff>
--- a/docs/TP1-dializador-respuestas.docx
+++ b/docs/TP1-dializador-respuestas.docx
@@ -1988,7 +1988,7 @@
           <w:sz w:val="22"/>
           <w:szCs w:val="22"/>
         </w:rPr>
-        <w:t xml:space="preserve">En solución salina isotónica a 37 °C (Tabla I), el coeficiente de difusión de la Vitamina B12 es </w:t>
+        <w:t xml:space="preserve">La Tabla I reporta difusividades en solución libre, sin membrana de por medio: salina isotónica a 37 °C y dilución infinita. Para la Vitamina B12 el valor adoptado es </w:t>
       </w:r>
       <w:r>
         <w:rPr>
@@ -2008,7 +2008,7 @@
           <w:sz w:val="22"/>
           <w:szCs w:val="22"/>
         </w:rPr>
-        <w:t xml:space="preserve">, frente a 1,81 × 10⁻⁹ m²/s para la urea.</w:t>
+        <w:t xml:space="preserve">, frente a 1,81 × 10⁻⁹ m²/s para la urea. Conviene aclarar que ese valor de la B12 no fue medido por los autores sino estimado mediante la correlación de Polson, con una precisión declarada de ± 15 %; el de la urea, en cambio, sí fue medido (± 3 %).</w:t>
       </w:r>
     </w:p>
     <w:p>
@@ -2022,7 +2022,7 @@
           <w:sz w:val="22"/>
           <w:szCs w:val="22"/>
         </w:rPr>
-        <w:t xml:space="preserve">Para el coeficiente dentro del polímero se empleó la Tabla III del mismo trabajo, que reporta las resistencias de membrana en Cuprophane PT-150 a 37 °C. Como todos los solutos se midieron sobre la misma membrana, el espesor y el área se cancelan y el cociente de resistencias da directamente el cociente de difusividades efectivas:</w:t>
+        <w:t xml:space="preserve">El coeficiente dentro del polímero es otra cosa y sale de otra tabla. La Tabla III reporta las resistencias de membrana medidas en Cuprophane PT-150 a 37 °C. Como todos los solutos se midieron sobre la misma membrana, el espesor y el área se cancelan y el cociente de resistencias da directamente el cociente de difusividades efectivas:</w:t>
       </w:r>
     </w:p>
     <w:p>

</xml_diff>

<commit_message>
Simplifica el punto 4: una respuesta por consigna
Se presentaban dos clearances en pie de igualdad (8,43 y 23,09), lo que
volvía confusa la respuesta. Ahora cada bala de la consigna tiene una
sola respuesta:

- Coeficiente investigado: 1,92e-11 m2/s en Cuprophane PT-150.
- Clearance: 8,43 mL/min, vía el cociente de resistencias aplicado al D
  del enunciado, porque la membrana que simula el TP no es el Cuprophane
  y el cociente sí es trasladable.

El valor alternativo queda como una frase aclaratoria en vez de una
segunda respuesta.

Se descarta el paper de TbMOF-100 consultado: es una estructura
metal-orgánica cristalina, no un polímero, pensada para capturar la
molécula y no para permearla. Su coeficiente es nueve órdenes de
magnitud menor y daría clearance nulo.

Co-Authored-By: Claude Opus 5 <noreply@anthropic.com>
</commit_message>
<xml_diff>
--- a/docs/TP1-dializador-respuestas.docx
+++ b/docs/TP1-dializador-respuestas.docx
@@ -1974,7 +1974,7 @@
           <w:sz w:val="22"/>
           <w:szCs w:val="22"/>
         </w:rPr>
-        <w:t xml:space="preserve">Se tomó como referencia el trabajo de Colton, Smith, Merrill y Farrell (1971), que midió las permeabilidades difusivas de membranas de celulosa regenerada con 15 solutos de peso molecular entre 58 y 68.000. El polímero elegido es el </w:t>
+        <w:t xml:space="preserve">Se tomó el trabajo de Colton, Smith, Merrill y Farrell (1971), que midió permeabilidades difusivas de membranas de celulosa regenerada con 15 solutos. El polímero elegido es el </w:t>
       </w:r>
       <w:r>
         <w:rPr>
@@ -2008,7 +2008,7 @@
           <w:sz w:val="22"/>
           <w:szCs w:val="22"/>
         </w:rPr>
-        <w:t xml:space="preserve">El trabajo no tabula el coeficiente de difusión directamente, sino la resistencia de membrana. La conversión es inmediata: la permeabilidad es la inversa de la resistencia, y por definición </w:t>
+        <w:t xml:space="preserve">El trabajo tabula la resistencia de membrana y no el coeficiente de difusión, pero la conversión es una división: la permeabilidad es la inversa de la resistencia, y </w:t>
       </w:r>
       <w:r>
         <w:rPr>
@@ -2017,16 +2017,16 @@
           <w:sz w:val="20"/>
           <w:szCs w:val="20"/>
         </w:rPr>
-        <w:t xml:space="preserve">P = K_s·D_m / L</w:t>
-      </w:r>
-      <w:r>
-        <w:rPr>
-          <w:rFonts w:ascii="Calibri" w:cs="Calibri" w:eastAsia="Calibri" w:hAnsi="Calibri"/>
-          <w:color w:val="10333C"/>
-          <w:sz w:val="22"/>
-          <w:szCs w:val="22"/>
-        </w:rPr>
-        <w:t xml:space="preserve">, de donde</w:t>
+        <w:t xml:space="preserve">P = D / L</w:t>
+      </w:r>
+      <w:r>
+        <w:rPr>
+          <w:rFonts w:ascii="Calibri" w:cs="Calibri" w:eastAsia="Calibri" w:hAnsi="Calibri"/>
+          <w:color w:val="10333C"/>
+          <w:sz w:val="22"/>
+          <w:szCs w:val="22"/>
+        </w:rPr>
+        <w:t xml:space="preserve">, de modo que</w:t>
       </w:r>
     </w:p>
     <w:p>
@@ -2043,7 +2043,7 @@
           <w:sz w:val="22"/>
           <w:szCs w:val="22"/>
         </w:rPr>
-        <w:t xml:space="preserve">K_s · D_m = t_m / R_m</w:t>
+        <w:t xml:space="preserve">D = t_m / R_m = 27,9 µm / 242 min·cm⁻¹</w:t>
       </w:r>
     </w:p>
     <w:p>
@@ -2053,11 +2053,22 @@
       <w:r>
         <w:rPr>
           <w:rFonts w:ascii="Calibri" w:cs="Calibri" w:eastAsia="Calibri" w:hAnsi="Calibri"/>
-          <w:color w:val="10333C"/>
-          <w:sz w:val="22"/>
-          <w:szCs w:val="22"/>
-        </w:rPr>
-        <w:t xml:space="preserve">Con los datos de la Tabla III (</w:t>
+          <w:b/>
+          <w:bCs/>
+          <w:color w:val="10333C"/>
+          <w:sz w:val="22"/>
+          <w:szCs w:val="22"/>
+        </w:rPr>
+        <w:t xml:space="preserve">El coeficiente de difusión de la Vitamina B12 en celulosa regenerada es 1,92 × 10⁻¹¹ m²/s</w:t>
+      </w:r>
+      <w:r>
+        <w:rPr>
+          <w:rFonts w:ascii="Calibri" w:cs="Calibri" w:eastAsia="Calibri" w:hAnsi="Calibri"/>
+          <w:color w:val="10333C"/>
+          <w:sz w:val="22"/>
+          <w:szCs w:val="22"/>
+        </w:rPr>
+        <w:t xml:space="preserve"> (Tabla III). Dividiendo por el coeficiente de partición </w:t>
       </w:r>
       <w:r>
         <w:rPr>
@@ -2066,16 +2077,16 @@
           <w:sz w:val="20"/>
           <w:szCs w:val="20"/>
         </w:rPr>
-        <w:t xml:space="preserve">R_m</w:t>
-      </w:r>
-      <w:r>
-        <w:rPr>
-          <w:rFonts w:ascii="Calibri" w:cs="Calibri" w:eastAsia="Calibri" w:hAnsi="Calibri"/>
-          <w:color w:val="10333C"/>
-          <w:sz w:val="22"/>
-          <w:szCs w:val="22"/>
-        </w:rPr>
-        <w:t xml:space="preserve"> = 242 min/cm, espesor húmedo </w:t>
+        <w:t xml:space="preserve">K_s</w:t>
+      </w:r>
+      <w:r>
+        <w:rPr>
+          <w:rFonts w:ascii="Calibri" w:cs="Calibri" w:eastAsia="Calibri" w:hAnsi="Calibri"/>
+          <w:color w:val="10333C"/>
+          <w:sz w:val="22"/>
+          <w:szCs w:val="22"/>
+        </w:rPr>
+        <w:t xml:space="preserve"> = 0,97 de la Tabla VII se obtiene la difusividad dentro de la fase membrana, 1,98 × 10⁻¹¹ m²/s; como </w:t>
       </w:r>
       <w:r>
         <w:rPr>
@@ -2084,16 +2095,59 @@
           <w:sz w:val="20"/>
           <w:szCs w:val="20"/>
         </w:rPr>
-        <w:t xml:space="preserve">t_m</w:t>
-      </w:r>
-      <w:r>
-        <w:rPr>
-          <w:rFonts w:ascii="Calibri" w:cs="Calibri" w:eastAsia="Calibri" w:hAnsi="Calibri"/>
-          <w:color w:val="10333C"/>
-          <w:sz w:val="22"/>
-          <w:szCs w:val="22"/>
-        </w:rPr>
-        <w:t xml:space="preserve"> = 1,10 mils = 27,9 µm) y de la Tabla VII (coeficiente de partición </w:t>
+        <w:t xml:space="preserve">K_s</w:t>
+      </w:r>
+      <w:r>
+        <w:rPr>
+          <w:rFonts w:ascii="Calibri" w:cs="Calibri" w:eastAsia="Calibri" w:hAnsi="Calibri"/>
+          <w:color w:val="10333C"/>
+          <w:sz w:val="22"/>
+          <w:szCs w:val="22"/>
+        </w:rPr>
+        <w:t xml:space="preserve"> vale casi uno, ambos valores prácticamente coinciden.</w:t>
+      </w:r>
+    </w:p>
+    <w:p>
+      <w:pPr>
+        <w:spacing w:after="130" w:line="300"/>
+      </w:pPr>
+      <w:r>
+        <w:rPr>
+          <w:rFonts w:ascii="Calibri" w:cs="Calibri" w:eastAsia="Calibri" w:hAnsi="Calibri"/>
+          <w:color w:val="10333C"/>
+          <w:sz w:val="22"/>
+          <w:szCs w:val="22"/>
+        </w:rPr>
+        <w:t xml:space="preserve">Se descartó un segundo trabajo consultado, sobre difusión de B12 en el material mesoporoso TbMOF-100, porque no es un polímero sino una estructura metal-orgánica cristalina destinada a capturar la molécula y no a permearla: el coeficiente allí reportado es nueve órdenes de magnitud menor y daría un clearance nulo.</w:t>
+      </w:r>
+    </w:p>
+    <w:p>
+      <w:pPr>
+        <w:pStyle w:val="Heading2"/>
+        <w:spacing w:after="130" w:before="240"/>
+      </w:pPr>
+      <w:r>
+        <w:rPr>
+          <w:rFonts w:ascii="Cambria" w:cs="Cambria" w:eastAsia="Cambria" w:hAnsi="Cambria"/>
+          <w:b/>
+          <w:bCs/>
+          <w:color w:val="10333C"/>
+        </w:rPr>
+        <w:t xml:space="preserve">4.2 Tasa de clearance</w:t>
+      </w:r>
+    </w:p>
+    <w:p>
+      <w:pPr>
+        <w:spacing w:after="130" w:line="300"/>
+      </w:pPr>
+      <w:r>
+        <w:rPr>
+          <w:rFonts w:ascii="Calibri" w:cs="Calibri" w:eastAsia="Calibri" w:hAnsi="Calibri"/>
+          <w:color w:val="10333C"/>
+          <w:sz w:val="22"/>
+          <w:szCs w:val="22"/>
+        </w:rPr>
+        <w:t xml:space="preserve">La membrana que simula el TP no es el Cuprophane: es una membrana genérica definida por el enunciado con </w:t>
       </w:r>
       <w:r>
         <w:rPr>
@@ -2102,303 +2156,17 @@
           <w:sz w:val="20"/>
           <w:szCs w:val="20"/>
         </w:rPr>
-        <w:t xml:space="preserve">K_s</w:t>
-      </w:r>
-      <w:r>
-        <w:rPr>
-          <w:rFonts w:ascii="Calibri" w:cs="Calibri" w:eastAsia="Calibri" w:hAnsi="Calibri"/>
-          <w:color w:val="10333C"/>
-          <w:sz w:val="22"/>
-          <w:szCs w:val="22"/>
-        </w:rPr>
-        <w:t xml:space="preserve"> = 0,97):</w:t>
-      </w:r>
-    </w:p>
-    <w:tbl>
-      <w:tblPr>
-        <w:tblW w:type="dxa" w:w="8400"/>
-        <w:tblBorders>
-          <w:top w:val="single" w:color="B8C8C6" w:sz="4"/>
-          <w:left w:val="none"/>
-          <w:bottom w:val="single" w:color="B8C8C6" w:sz="4"/>
-          <w:right w:val="none"/>
-          <w:insideH w:val="single" w:color="D6E2DF" w:sz="2"/>
-          <w:insideV w:val="none"/>
-        </w:tblBorders>
-      </w:tblPr>
-      <w:tblGrid>
-        <w:gridCol w:w="3100"/>
-        <w:gridCol w:w="2400"/>
-        <w:gridCol w:w="2900"/>
-      </w:tblGrid>
-      <w:tr>
-        <w:trPr>
-          <w:tblHeader/>
-        </w:trPr>
-        <w:tc>
-          <w:tcPr>
-            <w:tcW w:type="dxa" w:w="3100"/>
-            <w:shd w:fill="E3ECE9" w:val="clear"/>
-            <w:tcMar>
-              <w:top w:type="dxa" w:w="85"/>
-              <w:left w:type="dxa" w:w="120"/>
-              <w:bottom w:type="dxa" w:w="85"/>
-              <w:right w:type="dxa" w:w="120"/>
-            </w:tcMar>
-          </w:tcPr>
-          <w:p>
-            <w:pPr>
-              <w:spacing w:after="0"/>
-            </w:pPr>
-            <w:r>
-              <w:rPr>
-                <w:rFonts w:ascii="Calibri" w:cs="Calibri" w:eastAsia="Calibri" w:hAnsi="Calibri"/>
-                <w:b/>
-                <w:bCs/>
-                <w:color w:val="5A6A6E"/>
-                <w:sz w:val="19"/>
-                <w:szCs w:val="19"/>
-              </w:rPr>
-              <w:t xml:space="preserve">Magnitud</w:t>
-            </w:r>
-          </w:p>
-        </w:tc>
-        <w:tc>
-          <w:tcPr>
-            <w:tcW w:type="dxa" w:w="2400"/>
-            <w:shd w:fill="E3ECE9" w:val="clear"/>
-            <w:tcMar>
-              <w:top w:type="dxa" w:w="85"/>
-              <w:left w:type="dxa" w:w="120"/>
-              <w:bottom w:type="dxa" w:w="85"/>
-              <w:right w:type="dxa" w:w="120"/>
-            </w:tcMar>
-          </w:tcPr>
-          <w:p>
-            <w:pPr>
-              <w:spacing w:after="0"/>
-            </w:pPr>
-            <w:r>
-              <w:rPr>
-                <w:rFonts w:ascii="Calibri" w:cs="Calibri" w:eastAsia="Calibri" w:hAnsi="Calibri"/>
-                <w:b/>
-                <w:bCs/>
-                <w:color w:val="5A6A6E"/>
-                <w:sz w:val="19"/>
-                <w:szCs w:val="19"/>
-              </w:rPr>
-              <w:t xml:space="preserve">Valor</w:t>
-            </w:r>
-          </w:p>
-        </w:tc>
-        <w:tc>
-          <w:tcPr>
-            <w:tcW w:type="dxa" w:w="2900"/>
-            <w:shd w:fill="E3ECE9" w:val="clear"/>
-            <w:tcMar>
-              <w:top w:type="dxa" w:w="85"/>
-              <w:left w:type="dxa" w:w="120"/>
-              <w:bottom w:type="dxa" w:w="85"/>
-              <w:right w:type="dxa" w:w="120"/>
-            </w:tcMar>
-          </w:tcPr>
-          <w:p>
-            <w:pPr>
-              <w:spacing w:after="0"/>
-            </w:pPr>
-            <w:r>
-              <w:rPr>
-                <w:rFonts w:ascii="Calibri" w:cs="Calibri" w:eastAsia="Calibri" w:hAnsi="Calibri"/>
-                <w:b/>
-                <w:bCs/>
-                <w:color w:val="5A6A6E"/>
-                <w:sz w:val="19"/>
-                <w:szCs w:val="19"/>
-              </w:rPr>
-              <w:t xml:space="preserve">Significado</w:t>
-            </w:r>
-          </w:p>
-        </w:tc>
-      </w:tr>
-      <w:tr>
-        <w:tc>
-          <w:tcPr>
-            <w:tcW w:type="dxa" w:w="3100"/>
-            <w:tcMar>
-              <w:top w:type="dxa" w:w="85"/>
-              <w:left w:type="dxa" w:w="120"/>
-              <w:bottom w:type="dxa" w:w="85"/>
-              <w:right w:type="dxa" w:w="120"/>
-            </w:tcMar>
-          </w:tcPr>
-          <w:p>
-            <w:pPr>
-              <w:spacing w:after="0"/>
-            </w:pPr>
-            <w:r>
-              <w:rPr>
-                <w:rFonts w:ascii="Consolas" w:cs="Consolas" w:eastAsia="Consolas" w:hAnsi="Consolas"/>
-                <w:b w:val="false"/>
-                <w:bCs w:val="false"/>
-                <w:color w:val="10333C"/>
-                <w:sz w:val="19"/>
-                <w:szCs w:val="19"/>
-              </w:rPr>
-              <w:t xml:space="preserve">K_s · D_m</w:t>
-            </w:r>
-          </w:p>
-        </w:tc>
-        <w:tc>
-          <w:tcPr>
-            <w:tcW w:type="dxa" w:w="2400"/>
-            <w:tcMar>
-              <w:top w:type="dxa" w:w="85"/>
-              <w:left w:type="dxa" w:w="120"/>
-              <w:bottom w:type="dxa" w:w="85"/>
-              <w:right w:type="dxa" w:w="120"/>
-            </w:tcMar>
-          </w:tcPr>
-          <w:p>
-            <w:pPr>
-              <w:spacing w:after="0"/>
-            </w:pPr>
-            <w:r>
-              <w:rPr>
-                <w:rFonts w:ascii="Consolas" w:cs="Consolas" w:eastAsia="Consolas" w:hAnsi="Consolas"/>
-                <w:b w:val="false"/>
-                <w:bCs w:val="false"/>
-                <w:color w:val="10333C"/>
-                <w:sz w:val="19"/>
-                <w:szCs w:val="19"/>
-              </w:rPr>
-              <w:t xml:space="preserve">1,92 × 10⁻¹¹ m²/s</w:t>
-            </w:r>
-          </w:p>
-        </w:tc>
-        <w:tc>
-          <w:tcPr>
-            <w:tcW w:type="dxa" w:w="2900"/>
-            <w:tcMar>
-              <w:top w:type="dxa" w:w="85"/>
-              <w:left w:type="dxa" w:w="120"/>
-              <w:bottom w:type="dxa" w:w="85"/>
-              <w:right w:type="dxa" w:w="120"/>
-            </w:tcMar>
-          </w:tcPr>
-          <w:p>
-            <w:pPr>
-              <w:spacing w:after="0"/>
-            </w:pPr>
-            <w:r>
-              <w:rPr>
-                <w:rFonts w:ascii="Consolas" w:cs="Consolas" w:eastAsia="Consolas" w:hAnsi="Consolas"/>
-                <w:b w:val="false"/>
-                <w:bCs w:val="false"/>
-                <w:color w:val="10333C"/>
-                <w:sz w:val="19"/>
-                <w:szCs w:val="19"/>
-              </w:rPr>
-              <w:t xml:space="preserve">Es el D del modelo del TP</w:t>
-            </w:r>
-          </w:p>
-        </w:tc>
-      </w:tr>
-      <w:tr>
-        <w:tc>
-          <w:tcPr>
-            <w:tcW w:type="dxa" w:w="3100"/>
-            <w:tcMar>
-              <w:top w:type="dxa" w:w="85"/>
-              <w:left w:type="dxa" w:w="120"/>
-              <w:bottom w:type="dxa" w:w="85"/>
-              <w:right w:type="dxa" w:w="120"/>
-            </w:tcMar>
-          </w:tcPr>
-          <w:p>
-            <w:pPr>
-              <w:spacing w:after="0"/>
-            </w:pPr>
-            <w:r>
-              <w:rPr>
-                <w:rFonts w:ascii="Consolas" w:cs="Consolas" w:eastAsia="Consolas" w:hAnsi="Consolas"/>
-                <w:b w:val="false"/>
-                <w:bCs w:val="false"/>
-                <w:color w:val="10333C"/>
-                <w:sz w:val="19"/>
-                <w:szCs w:val="19"/>
-              </w:rPr>
-              <w:t xml:space="preserve">D_m</w:t>
-            </w:r>
-          </w:p>
-        </w:tc>
-        <w:tc>
-          <w:tcPr>
-            <w:tcW w:type="dxa" w:w="2400"/>
-            <w:tcMar>
-              <w:top w:type="dxa" w:w="85"/>
-              <w:left w:type="dxa" w:w="120"/>
-              <w:bottom w:type="dxa" w:w="85"/>
-              <w:right w:type="dxa" w:w="120"/>
-            </w:tcMar>
-          </w:tcPr>
-          <w:p>
-            <w:pPr>
-              <w:spacing w:after="0"/>
-            </w:pPr>
-            <w:r>
-              <w:rPr>
-                <w:rFonts w:ascii="Consolas" w:cs="Consolas" w:eastAsia="Consolas" w:hAnsi="Consolas"/>
-                <w:b w:val="false"/>
-                <w:bCs w:val="false"/>
-                <w:color w:val="10333C"/>
-                <w:sz w:val="19"/>
-                <w:szCs w:val="19"/>
-              </w:rPr>
-              <w:t xml:space="preserve">1,98 × 10⁻¹¹ m²/s</w:t>
-            </w:r>
-          </w:p>
-        </w:tc>
-        <w:tc>
-          <w:tcPr>
-            <w:tcW w:type="dxa" w:w="2900"/>
-            <w:tcMar>
-              <w:top w:type="dxa" w:w="85"/>
-              <w:left w:type="dxa" w:w="120"/>
-              <w:bottom w:type="dxa" w:w="85"/>
-              <w:right w:type="dxa" w:w="120"/>
-            </w:tcMar>
-          </w:tcPr>
-          <w:p>
-            <w:pPr>
-              <w:spacing w:after="0"/>
-            </w:pPr>
-            <w:r>
-              <w:rPr>
-                <w:rFonts w:ascii="Consolas" w:cs="Consolas" w:eastAsia="Consolas" w:hAnsi="Consolas"/>
-                <w:b w:val="false"/>
-                <w:bCs w:val="false"/>
-                <w:color w:val="10333C"/>
-                <w:sz w:val="19"/>
-                <w:szCs w:val="19"/>
-              </w:rPr>
-              <w:t xml:space="preserve">Difusividad en la fase membrana</w:t>
-            </w:r>
-          </w:p>
-        </w:tc>
-      </w:tr>
-    </w:tbl>
-    <w:p>
-      <w:pPr>
-        <w:spacing w:after="220"/>
-      </w:pPr>
-      <w:r>
-        <w:t xml:space="preserve"/>
-      </w:r>
-    </w:p>
-    <w:p>
-      <w:pPr>
-        <w:spacing w:after="130" w:line="300"/>
-      </w:pPr>
+        <w:t xml:space="preserve">D</w:t>
+      </w:r>
+      <w:r>
+        <w:rPr>
+          <w:rFonts w:ascii="Calibri" w:cs="Calibri" w:eastAsia="Calibri" w:hAnsi="Calibri"/>
+          <w:color w:val="10333C"/>
+          <w:sz w:val="22"/>
+          <w:szCs w:val="22"/>
+        </w:rPr>
+        <w:t xml:space="preserve"> = 1 × 10⁻¹⁰ m²/s para la urea. Lo que aporta Colton, y que sí es trasladable, es el </w:t>
+      </w:r>
       <w:r>
         <w:rPr>
           <w:rFonts w:ascii="Calibri" w:cs="Calibri" w:eastAsia="Calibri" w:hAnsi="Calibri"/>
@@ -2408,16 +2176,47 @@
           <w:sz w:val="22"/>
           <w:szCs w:val="22"/>
         </w:rPr>
-        <w:t xml:space="preserve">El coeficiente de difusión de la Vitamina B12 en celulosa regenerada es 1,92 × 10⁻¹¹ m²/s.</w:t>
-      </w:r>
-      <w:r>
-        <w:rPr>
-          <w:rFonts w:ascii="Calibri" w:cs="Calibri" w:eastAsia="Calibri" w:hAnsi="Calibri"/>
-          <w:color w:val="10333C"/>
-          <w:sz w:val="22"/>
-          <w:szCs w:val="22"/>
-        </w:rPr>
-        <w:t xml:space="preserve"> Conviene usar el producto </w:t>
+        <w:t xml:space="preserve">cociente entre solutos</w:t>
+      </w:r>
+      <w:r>
+        <w:rPr>
+          <w:rFonts w:ascii="Calibri" w:cs="Calibri" w:eastAsia="Calibri" w:hAnsi="Calibri"/>
+          <w:color w:val="10333C"/>
+          <w:sz w:val="22"/>
+          <w:szCs w:val="22"/>
+        </w:rPr>
+        <w:t xml:space="preserve">, porque ambos se midieron sobre la misma membrana y por lo tanto el espesor y el área se cancelan:</w:t>
+      </w:r>
+    </w:p>
+    <w:p>
+      <w:pPr>
+        <w:spacing w:after="160" w:before="140"/>
+        <w:jc w:val="center"/>
+      </w:pPr>
+      <w:r>
+        <w:rPr>
+          <w:rFonts w:ascii="Consolas" w:cs="Consolas" w:eastAsia="Consolas" w:hAnsi="Consolas"/>
+          <w:b/>
+          <w:bCs/>
+          <w:color w:val="097A5E"/>
+          <w:sz w:val="22"/>
+          <w:szCs w:val="22"/>
+        </w:rPr>
+        <w:t xml:space="preserve">D_B12 / D_urea = R_m(urea) / R_m(B12) = 17,0 / 242 = 0,0702</w:t>
+      </w:r>
+    </w:p>
+    <w:p>
+      <w:pPr>
+        <w:spacing w:after="130" w:line="300"/>
+      </w:pPr>
+      <w:r>
+        <w:rPr>
+          <w:rFonts w:ascii="Calibri" w:cs="Calibri" w:eastAsia="Calibri" w:hAnsi="Calibri"/>
+          <w:color w:val="10333C"/>
+          <w:sz w:val="22"/>
+          <w:szCs w:val="22"/>
+        </w:rPr>
+        <w:t xml:space="preserve">Aplicado al coeficiente del enunciado resulta </w:t>
       </w:r>
       <w:r>
         <w:rPr>
@@ -2426,133 +2225,16 @@
           <w:sz w:val="20"/>
           <w:szCs w:val="20"/>
         </w:rPr>
-        <w:t xml:space="preserve">K_s·D_m</w:t>
-      </w:r>
-      <w:r>
-        <w:rPr>
-          <w:rFonts w:ascii="Calibri" w:cs="Calibri" w:eastAsia="Calibri" w:hAnsi="Calibri"/>
-          <w:color w:val="10333C"/>
-          <w:sz w:val="22"/>
-          <w:szCs w:val="22"/>
-        </w:rPr>
-        <w:t xml:space="preserve"> y no </w:t>
-      </w:r>
-      <w:r>
-        <w:rPr>
-          <w:rFonts w:ascii="Consolas" w:cs="Consolas" w:eastAsia="Consolas" w:hAnsi="Consolas"/>
-          <w:color w:val="097A5E"/>
-          <w:sz w:val="20"/>
-          <w:szCs w:val="20"/>
-        </w:rPr>
-        <w:t xml:space="preserve">D_m</w:t>
-      </w:r>
-      <w:r>
-        <w:rPr>
-          <w:rFonts w:ascii="Calibri" w:cs="Calibri" w:eastAsia="Calibri" w:hAnsi="Calibri"/>
-          <w:color w:val="10333C"/>
-          <w:sz w:val="22"/>
-          <w:szCs w:val="22"/>
-        </w:rPr>
-        <w:t xml:space="preserve"> a secas, porque el modelo del TP define el clearance contra la concentración del lado de la sangre: </w:t>
-      </w:r>
-      <w:r>
-        <w:rPr>
-          <w:rFonts w:ascii="Consolas" w:cs="Consolas" w:eastAsia="Consolas" w:hAnsi="Consolas"/>
-          <w:color w:val="097A5E"/>
-          <w:sz w:val="20"/>
-          <w:szCs w:val="20"/>
-        </w:rPr>
-        <w:t xml:space="preserve">Cl = (K_s·D_m/L)·A</w:t>
-      </w:r>
-      <w:r>
-        <w:rPr>
-          <w:rFonts w:ascii="Calibri" w:cs="Calibri" w:eastAsia="Calibri" w:hAnsi="Calibri"/>
-          <w:color w:val="10333C"/>
-          <w:sz w:val="22"/>
-          <w:szCs w:val="22"/>
-        </w:rPr>
-        <w:t xml:space="preserve">. Como en este caso </w:t>
-      </w:r>
-      <w:r>
-        <w:rPr>
-          <w:rFonts w:ascii="Consolas" w:cs="Consolas" w:eastAsia="Consolas" w:hAnsi="Consolas"/>
-          <w:color w:val="097A5E"/>
-          <w:sz w:val="20"/>
-          <w:szCs w:val="20"/>
-        </w:rPr>
-        <w:t xml:space="preserve">K_s</w:t>
-      </w:r>
-      <w:r>
-        <w:rPr>
-          <w:rFonts w:ascii="Calibri" w:cs="Calibri" w:eastAsia="Calibri" w:hAnsi="Calibri"/>
-          <w:color w:val="10333C"/>
-          <w:sz w:val="22"/>
-          <w:szCs w:val="22"/>
-        </w:rPr>
-        <w:t xml:space="preserve"> vale casi uno, ambos valores casi coinciden.</w:t>
-      </w:r>
-    </w:p>
-    <w:p>
-      <w:pPr>
-        <w:spacing w:after="130" w:line="300"/>
-      </w:pPr>
-      <w:r>
-        <w:rPr>
-          <w:rFonts w:ascii="Calibri" w:cs="Calibri" w:eastAsia="Calibri" w:hAnsi="Calibri"/>
-          <w:color w:val="10333C"/>
-          <w:sz w:val="22"/>
-          <w:szCs w:val="22"/>
-        </w:rPr>
-        <w:t xml:space="preserve">A modo de referencia, la Tabla I del mismo trabajo reporta la difusividad en solución libre (salina isotónica, 37 °C): </w:t>
-      </w:r>
-      <w:r>
-        <w:rPr>
-          <w:rFonts w:ascii="Calibri" w:cs="Calibri" w:eastAsia="Calibri" w:hAnsi="Calibri"/>
-          <w:b/>
-          <w:bCs/>
-          <w:color w:val="10333C"/>
-          <w:sz w:val="22"/>
-          <w:szCs w:val="22"/>
-        </w:rPr>
-        <w:t xml:space="preserve">3,79 × 10⁻¹⁰ m²/s</w:t>
-      </w:r>
-      <w:r>
-        <w:rPr>
-          <w:rFonts w:ascii="Calibri" w:cs="Calibri" w:eastAsia="Calibri" w:hAnsi="Calibri"/>
-          <w:color w:val="10333C"/>
-          <w:sz w:val="22"/>
-          <w:szCs w:val="22"/>
-        </w:rPr>
-        <w:t xml:space="preserve"> para la B12 contra 1,81 × 10⁻⁹ m²/s para la urea. Ese valor de la B12 no fue medido por los autores sino estimado mediante la correlación de Polson, con una precisión declarada de ± 15 %; el de la urea sí fue medido (± 3 %).</w:t>
-      </w:r>
-    </w:p>
-    <w:p>
-      <w:pPr>
-        <w:pStyle w:val="Heading2"/>
-        <w:spacing w:after="130" w:before="240"/>
-      </w:pPr>
-      <w:r>
-        <w:rPr>
-          <w:rFonts w:ascii="Cambria" w:cs="Cambria" w:eastAsia="Cambria" w:hAnsi="Cambria"/>
-          <w:b/>
-          <w:bCs/>
-          <w:color w:val="10333C"/>
-        </w:rPr>
-        <w:t xml:space="preserve">4.2 Tasa de clearance</w:t>
-      </w:r>
-    </w:p>
-    <w:p>
-      <w:pPr>
-        <w:spacing w:after="130" w:line="300"/>
-      </w:pPr>
-      <w:r>
-        <w:rPr>
-          <w:rFonts w:ascii="Calibri" w:cs="Calibri" w:eastAsia="Calibri" w:hAnsi="Calibri"/>
-          <w:color w:val="10333C"/>
-          <w:sz w:val="22"/>
-          <w:szCs w:val="22"/>
-        </w:rPr>
-        <w:t xml:space="preserve">Aplicando el coeficiente investigado a la geometría del TP (L = 50 µm, A = 1 m²):</w:t>
+        <w:t xml:space="preserve">D_B12</w:t>
+      </w:r>
+      <w:r>
+        <w:rPr>
+          <w:rFonts w:ascii="Calibri" w:cs="Calibri" w:eastAsia="Calibri" w:hAnsi="Calibri"/>
+          <w:color w:val="10333C"/>
+          <w:sz w:val="22"/>
+          <w:szCs w:val="22"/>
+        </w:rPr>
+        <w:t xml:space="preserve"> = 7,03 × 10⁻¹² m²/s, y con la geometría base (L = 50 µm, A = 1 m²):</w:t>
       </w:r>
     </w:p>
     <w:p>
@@ -2569,7 +2251,7 @@
           <w:sz w:val="22"/>
           <w:szCs w:val="22"/>
         </w:rPr>
-        <w:t xml:space="preserve">Cl = D · A / L = 1,92×10⁻¹¹ · 1 / 50×10⁻⁶ = 3,85×10⁻⁷ m³/s</w:t>
+        <w:t xml:space="preserve">Cl = D · A / L = 7,03×10⁻¹² · 1 / 50×10⁻⁶ = 1,41×10⁻⁷ m³/s</w:t>
       </w:r>
     </w:p>
     <w:p>
@@ -2585,7 +2267,16 @@
           <w:sz w:val="22"/>
           <w:szCs w:val="22"/>
         </w:rPr>
-        <w:t xml:space="preserve">El clearance de la Vitamina B12 es de 23,09 mL/min.</w:t>
+        <w:t xml:space="preserve">El clearance de la Vitamina B12 es de 8,43 mL/min</w:t>
+      </w:r>
+      <w:r>
+        <w:rPr>
+          <w:rFonts w:ascii="Calibri" w:cs="Calibri" w:eastAsia="Calibri" w:hAnsi="Calibri"/>
+          <w:color w:val="10333C"/>
+          <w:sz w:val="22"/>
+          <w:szCs w:val="22"/>
+        </w:rPr>
+        <w:t xml:space="preserve">, unas 14 veces menor que el de la urea.</w:t>
       </w:r>
     </w:p>
     <w:p>
@@ -2599,402 +2290,27 @@
           <w:sz w:val="22"/>
           <w:szCs w:val="22"/>
         </w:rPr>
-        <w:t xml:space="preserve">Un cálculo alternativo consiste en no usar el valor absoluto sino el cociente de resistencias, aplicándolo sobre el coeficiente de la urea que da la consigna. Como ambos solutos se midieron sobre la misma membrana, ese cociente es directamente el de difusividades:</w:t>
-      </w:r>
-    </w:p>
-    <w:p>
-      <w:pPr>
-        <w:spacing w:after="160" w:before="140"/>
-        <w:jc w:val="center"/>
-      </w:pPr>
-      <w:r>
-        <w:rPr>
-          <w:rFonts w:ascii="Consolas" w:cs="Consolas" w:eastAsia="Consolas" w:hAnsi="Consolas"/>
+        <w:t xml:space="preserve">Se usa el cociente y no el valor absoluto medido porque el cociente es una propiedad del par soluto–membrana, mientras que el valor absoluto corresponde a otra membrana. Si en cambio se supusiera que la membrana del enunciado </w:t>
+      </w:r>
+      <w:r>
+        <w:rPr>
+          <w:rFonts w:ascii="Calibri" w:cs="Calibri" w:eastAsia="Calibri" w:hAnsi="Calibri"/>
           <w:b/>
           <w:bCs/>
-          <w:color w:val="097A5E"/>
-          <w:sz w:val="22"/>
-          <w:szCs w:val="22"/>
-        </w:rPr>
-        <w:t xml:space="preserve">D_B12 / D_urea = R_m(urea) / R_m(B12) = 17,0 / 242 = 0,0702</w:t>
-      </w:r>
-    </w:p>
-    <w:p>
-      <w:pPr>
-        <w:spacing w:after="130" w:line="300"/>
-      </w:pPr>
-      <w:r>
-        <w:rPr>
-          <w:rFonts w:ascii="Calibri" w:cs="Calibri" w:eastAsia="Calibri" w:hAnsi="Calibri"/>
-          <w:color w:val="10333C"/>
-          <w:sz w:val="22"/>
-          <w:szCs w:val="22"/>
-        </w:rPr>
-        <w:t xml:space="preserve">Por esta vía resulta </w:t>
-      </w:r>
-      <w:r>
-        <w:rPr>
-          <w:rFonts w:ascii="Consolas" w:cs="Consolas" w:eastAsia="Consolas" w:hAnsi="Consolas"/>
-          <w:color w:val="097A5E"/>
-          <w:sz w:val="20"/>
-          <w:szCs w:val="20"/>
-        </w:rPr>
-        <w:t xml:space="preserve">D</w:t>
-      </w:r>
-      <w:r>
-        <w:rPr>
-          <w:rFonts w:ascii="Calibri" w:cs="Calibri" w:eastAsia="Calibri" w:hAnsi="Calibri"/>
-          <w:color w:val="10333C"/>
-          <w:sz w:val="22"/>
-          <w:szCs w:val="22"/>
-        </w:rPr>
-        <w:t xml:space="preserve"> = 7,03 × 10⁻¹² m²/s y un clearance de </w:t>
-      </w:r>
-      <w:r>
-        <w:rPr>
-          <w:rFonts w:ascii="Calibri" w:cs="Calibri" w:eastAsia="Calibri" w:hAnsi="Calibri"/>
-          <w:b/>
-          <w:bCs/>
-          <w:color w:val="10333C"/>
-          <w:sz w:val="22"/>
-          <w:szCs w:val="22"/>
-        </w:rPr>
-        <w:t xml:space="preserve">8,43 mL/min</w:t>
-      </w:r>
-      <w:r>
-        <w:rPr>
-          <w:rFonts w:ascii="Calibri" w:cs="Calibri" w:eastAsia="Calibri" w:hAnsi="Calibri"/>
-          <w:color w:val="10333C"/>
-          <w:sz w:val="22"/>
-          <w:szCs w:val="22"/>
-        </w:rPr>
-        <w:t xml:space="preserve">.</w:t>
-      </w:r>
-    </w:p>
-    <w:tbl>
-      <w:tblPr>
-        <w:tblW w:type="dxa" w:w="8400"/>
-        <w:tblBorders>
-          <w:top w:val="single" w:color="B8C8C6" w:sz="4"/>
-          <w:left w:val="none"/>
-          <w:bottom w:val="single" w:color="B8C8C6" w:sz="4"/>
-          <w:right w:val="none"/>
-          <w:insideH w:val="single" w:color="D6E2DF" w:sz="2"/>
-          <w:insideV w:val="none"/>
-        </w:tblBorders>
-      </w:tblPr>
-      <w:tblGrid>
-        <w:gridCol w:w="2900"/>
-        <w:gridCol w:w="2400"/>
-        <w:gridCol w:w="3100"/>
-      </w:tblGrid>
-      <w:tr>
-        <w:trPr>
-          <w:tblHeader/>
-        </w:trPr>
-        <w:tc>
-          <w:tcPr>
-            <w:tcW w:type="dxa" w:w="2900"/>
-            <w:shd w:fill="E3ECE9" w:val="clear"/>
-            <w:tcMar>
-              <w:top w:type="dxa" w:w="85"/>
-              <w:left w:type="dxa" w:w="120"/>
-              <w:bottom w:type="dxa" w:w="85"/>
-              <w:right w:type="dxa" w:w="120"/>
-            </w:tcMar>
-          </w:tcPr>
-          <w:p>
-            <w:pPr>
-              <w:spacing w:after="0"/>
-            </w:pPr>
-            <w:r>
-              <w:rPr>
-                <w:rFonts w:ascii="Calibri" w:cs="Calibri" w:eastAsia="Calibri" w:hAnsi="Calibri"/>
-                <w:b/>
-                <w:bCs/>
-                <w:color w:val="5A6A6E"/>
-                <w:sz w:val="19"/>
-                <w:szCs w:val="19"/>
-              </w:rPr>
-              <w:t xml:space="preserve">Vía de cálculo</w:t>
-            </w:r>
-          </w:p>
-        </w:tc>
-        <w:tc>
-          <w:tcPr>
-            <w:tcW w:type="dxa" w:w="2400"/>
-            <w:shd w:fill="E3ECE9" w:val="clear"/>
-            <w:tcMar>
-              <w:top w:type="dxa" w:w="85"/>
-              <w:left w:type="dxa" w:w="120"/>
-              <w:bottom w:type="dxa" w:w="85"/>
-              <w:right w:type="dxa" w:w="120"/>
-            </w:tcMar>
-          </w:tcPr>
-          <w:p>
-            <w:pPr>
-              <w:spacing w:after="0"/>
-            </w:pPr>
-            <w:r>
-              <w:rPr>
-                <w:rFonts w:ascii="Calibri" w:cs="Calibri" w:eastAsia="Calibri" w:hAnsi="Calibri"/>
-                <w:b/>
-                <w:bCs/>
-                <w:color w:val="5A6A6E"/>
-                <w:sz w:val="19"/>
-                <w:szCs w:val="19"/>
-              </w:rPr>
-              <w:t xml:space="preserve">Cl B12</w:t>
-            </w:r>
-          </w:p>
-        </w:tc>
-        <w:tc>
-          <w:tcPr>
-            <w:tcW w:type="dxa" w:w="3100"/>
-            <w:shd w:fill="E3ECE9" w:val="clear"/>
-            <w:tcMar>
-              <w:top w:type="dxa" w:w="85"/>
-              <w:left w:type="dxa" w:w="120"/>
-              <w:bottom w:type="dxa" w:w="85"/>
-              <w:right w:type="dxa" w:w="120"/>
-            </w:tcMar>
-          </w:tcPr>
-          <w:p>
-            <w:pPr>
-              <w:spacing w:after="0"/>
-            </w:pPr>
-            <w:r>
-              <w:rPr>
-                <w:rFonts w:ascii="Calibri" w:cs="Calibri" w:eastAsia="Calibri" w:hAnsi="Calibri"/>
-                <w:b/>
-                <w:bCs/>
-                <w:color w:val="5A6A6E"/>
-                <w:sz w:val="19"/>
-                <w:szCs w:val="19"/>
-              </w:rPr>
-              <w:t xml:space="preserve">Coherencia con la urea</w:t>
-            </w:r>
-          </w:p>
-        </w:tc>
-      </w:tr>
-      <w:tr>
-        <w:tc>
-          <w:tcPr>
-            <w:tcW w:type="dxa" w:w="2900"/>
-            <w:tcMar>
-              <w:top w:type="dxa" w:w="85"/>
-              <w:left w:type="dxa" w:w="120"/>
-              <w:bottom w:type="dxa" w:w="85"/>
-              <w:right w:type="dxa" w:w="120"/>
-            </w:tcMar>
-          </w:tcPr>
-          <w:p>
-            <w:pPr>
-              <w:spacing w:after="0"/>
-            </w:pPr>
-            <w:r>
-              <w:rPr>
-                <w:rFonts w:ascii="Consolas" w:cs="Consolas" w:eastAsia="Consolas" w:hAnsi="Consolas"/>
-                <w:b w:val="false"/>
-                <w:bCs w:val="false"/>
-                <w:color w:val="10333C"/>
-                <w:sz w:val="19"/>
-                <w:szCs w:val="19"/>
-              </w:rPr>
-              <w:t xml:space="preserve">D medido en Cuprophane</w:t>
-            </w:r>
-          </w:p>
-        </w:tc>
-        <w:tc>
-          <w:tcPr>
-            <w:tcW w:type="dxa" w:w="2400"/>
-            <w:tcMar>
-              <w:top w:type="dxa" w:w="85"/>
-              <w:left w:type="dxa" w:w="120"/>
-              <w:bottom w:type="dxa" w:w="85"/>
-              <w:right w:type="dxa" w:w="120"/>
-            </w:tcMar>
-          </w:tcPr>
-          <w:p>
-            <w:pPr>
-              <w:spacing w:after="0"/>
-            </w:pPr>
-            <w:r>
-              <w:rPr>
-                <w:rFonts w:ascii="Consolas" w:cs="Consolas" w:eastAsia="Consolas" w:hAnsi="Consolas"/>
-                <w:b w:val="false"/>
-                <w:bCs w:val="false"/>
-                <w:color w:val="10333C"/>
-                <w:sz w:val="19"/>
-                <w:szCs w:val="19"/>
-              </w:rPr>
-              <w:t xml:space="preserve">23,09 mL/min</w:t>
-            </w:r>
-          </w:p>
-        </w:tc>
-        <w:tc>
-          <w:tcPr>
-            <w:tcW w:type="dxa" w:w="3100"/>
-            <w:tcMar>
-              <w:top w:type="dxa" w:w="85"/>
-              <w:left w:type="dxa" w:w="120"/>
-              <w:bottom w:type="dxa" w:w="85"/>
-              <w:right w:type="dxa" w:w="120"/>
-            </w:tcMar>
-          </w:tcPr>
-          <w:p>
-            <w:pPr>
-              <w:spacing w:after="0"/>
-            </w:pPr>
-            <w:r>
-              <w:rPr>
-                <w:rFonts w:ascii="Consolas" w:cs="Consolas" w:eastAsia="Consolas" w:hAnsi="Consolas"/>
-                <w:b w:val="false"/>
-                <w:bCs w:val="false"/>
-                <w:color w:val="10333C"/>
-                <w:sz w:val="19"/>
-                <w:szCs w:val="19"/>
-              </w:rPr>
-              <w:t xml:space="preserve">Urea daría 328,7 mL/min</w:t>
-            </w:r>
-          </w:p>
-        </w:tc>
-      </w:tr>
-      <w:tr>
-        <w:tc>
-          <w:tcPr>
-            <w:tcW w:type="dxa" w:w="2900"/>
-            <w:tcMar>
-              <w:top w:type="dxa" w:w="85"/>
-              <w:left w:type="dxa" w:w="120"/>
-              <w:bottom w:type="dxa" w:w="85"/>
-              <w:right w:type="dxa" w:w="120"/>
-            </w:tcMar>
-          </w:tcPr>
-          <w:p>
-            <w:pPr>
-              <w:spacing w:after="0"/>
-            </w:pPr>
-            <w:r>
-              <w:rPr>
-                <w:rFonts w:ascii="Consolas" w:cs="Consolas" w:eastAsia="Consolas" w:hAnsi="Consolas"/>
-                <w:b w:val="false"/>
-                <w:bCs w:val="false"/>
-                <w:color w:val="10333C"/>
-                <w:sz w:val="19"/>
-                <w:szCs w:val="19"/>
-              </w:rPr>
-              <w:t xml:space="preserve">Cociente sobre el D de cátedra</w:t>
-            </w:r>
-          </w:p>
-        </w:tc>
-        <w:tc>
-          <w:tcPr>
-            <w:tcW w:type="dxa" w:w="2400"/>
-            <w:tcMar>
-              <w:top w:type="dxa" w:w="85"/>
-              <w:left w:type="dxa" w:w="120"/>
-              <w:bottom w:type="dxa" w:w="85"/>
-              <w:right w:type="dxa" w:w="120"/>
-            </w:tcMar>
-          </w:tcPr>
-          <w:p>
-            <w:pPr>
-              <w:spacing w:after="0"/>
-            </w:pPr>
-            <w:r>
-              <w:rPr>
-                <w:rFonts w:ascii="Consolas" w:cs="Consolas" w:eastAsia="Consolas" w:hAnsi="Consolas"/>
-                <w:b w:val="false"/>
-                <w:bCs w:val="false"/>
-                <w:color w:val="10333C"/>
-                <w:sz w:val="19"/>
-                <w:szCs w:val="19"/>
-              </w:rPr>
-              <w:t xml:space="preserve">8,43 mL/min</w:t>
-            </w:r>
-          </w:p>
-        </w:tc>
-        <w:tc>
-          <w:tcPr>
-            <w:tcW w:type="dxa" w:w="3100"/>
-            <w:tcMar>
-              <w:top w:type="dxa" w:w="85"/>
-              <w:left w:type="dxa" w:w="120"/>
-              <w:bottom w:type="dxa" w:w="85"/>
-              <w:right w:type="dxa" w:w="120"/>
-            </w:tcMar>
-          </w:tcPr>
-          <w:p>
-            <w:pPr>
-              <w:spacing w:after="0"/>
-            </w:pPr>
-            <w:r>
-              <w:rPr>
-                <w:rFonts w:ascii="Consolas" w:cs="Consolas" w:eastAsia="Consolas" w:hAnsi="Consolas"/>
-                <w:b w:val="false"/>
-                <w:bCs w:val="false"/>
-                <w:color w:val="10333C"/>
-                <w:sz w:val="19"/>
-                <w:szCs w:val="19"/>
-              </w:rPr>
-              <w:t xml:space="preserve">Urea da 120,00 mL/min</w:t>
-            </w:r>
-          </w:p>
-        </w:tc>
-      </w:tr>
-    </w:tbl>
-    <w:p>
-      <w:pPr>
-        <w:spacing w:after="220"/>
-      </w:pPr>
-      <w:r>
-        <w:t xml:space="preserve"/>
-      </w:r>
-    </w:p>
-    <w:p>
-      <w:pPr>
-        <w:spacing w:after="130" w:line="300"/>
-      </w:pPr>
-      <w:r>
-        <w:rPr>
-          <w:rFonts w:ascii="Calibri" w:cs="Calibri" w:eastAsia="Calibri" w:hAnsi="Calibri"/>
-          <w:b/>
-          <w:bCs/>
-          <w:color w:val="10333C"/>
-          <w:sz w:val="22"/>
-          <w:szCs w:val="22"/>
-        </w:rPr>
-        <w:t xml:space="preserve">La diferencia no es un error sino un dato.</w:t>
-      </w:r>
-      <w:r>
-        <w:rPr>
-          <w:rFonts w:ascii="Calibri" w:cs="Calibri" w:eastAsia="Calibri" w:hAnsi="Calibri"/>
-          <w:color w:val="10333C"/>
-          <w:sz w:val="22"/>
-          <w:szCs w:val="22"/>
-        </w:rPr>
-        <w:t xml:space="preserve"> El coeficiente de la urea que fija la consigna, 1 × 10⁻¹⁰ m²/s, es 2,74 veces menor que el que efectivamente tiene el Cuprophane (2,74 × 10⁻¹⁰ m²/s por la misma conversión). Es decir que la membrana genérica del enunciado es bastante menos permeable que la celulosa regenerada real. Cada vía responde a una pregunta distinta: la primera, cuánto depuraría un Cuprophane con esa geometría; la segunda, cuánto depura la membrana del enunciado. </w:t>
-      </w:r>
-      <w:r>
-        <w:rPr>
-          <w:rFonts w:ascii="Calibri" w:cs="Calibri" w:eastAsia="Calibri" w:hAnsi="Calibri"/>
-          <w:b/>
-          <w:bCs/>
-          <w:color w:val="10333C"/>
-          <w:sz w:val="22"/>
-          <w:szCs w:val="22"/>
-        </w:rPr>
-        <w:t xml:space="preserve">El cociente 0,0702 entre B12 y urea es el mismo en ambas</w:t>
-      </w:r>
-      <w:r>
-        <w:rPr>
-          <w:rFonts w:ascii="Calibri" w:cs="Calibri" w:eastAsia="Calibri" w:hAnsi="Calibri"/>
-          <w:color w:val="10333C"/>
-          <w:sz w:val="22"/>
-          <w:szCs w:val="22"/>
-        </w:rPr>
-        <w:t xml:space="preserve">, porque es una propiedad del par soluto–membrana y no depende del valor absoluto adoptado.</w:t>
+          <w:color w:val="10333C"/>
+          <w:sz w:val="22"/>
+          <w:szCs w:val="22"/>
+        </w:rPr>
+        <w:t xml:space="preserve">es</w:t>
+      </w:r>
+      <w:r>
+        <w:rPr>
+          <w:rFonts w:ascii="Calibri" w:cs="Calibri" w:eastAsia="Calibri" w:hAnsi="Calibri"/>
+          <w:color w:val="10333C"/>
+          <w:sz w:val="22"/>
+          <w:szCs w:val="22"/>
+        </w:rPr>
+        <w:t xml:space="preserve"> el Cuprophane, el clearance de la B12 sería 23,09 mL/min, pero entonces la urea daría 328,7 mL/min y no los 120 que fija la consigna: el Cuprophane real es 2,74 veces más permeable que la membrana del enunciado.</w:t>
       </w:r>
     </w:p>
     <w:p>

</xml_diff>